<commit_message>
docs: simplify Lab05C scope table
</commit_message>
<xml_diff>
--- a/Lab05/5C/BaoCao_Lab05C_WinFormNangCao_NguyenHuynhPhuongDong_3124411071.docx
+++ b/Lab05/5C/BaoCao_Lab05C_WinFormNangCao_NguyenHuynhPhuongDong_3124411071.docx
@@ -249,9 +249,8 @@
         <w:tblLook w:firstColumn="1" w:firstRow="1" w:lastColumn="0" w:lastRow="0" w:noHBand="0" w:noVBand="1" w:val="04A0"/>
       </w:tblPr>
       <w:tblGrid>
-        <w:gridCol w:w="3213"/>
-        <w:gridCol w:w="3213"/>
-        <w:gridCol w:w="3213"/>
+        <w:gridCol w:w="4819"/>
+        <w:gridCol w:w="4819"/>
       </w:tblGrid>
       <w:tr>
         <w:trPr>
@@ -260,7 +259,7 @@
         </w:trPr>
         <w:tc>
           <w:tcPr>
-            <w:tcW w:type="dxa" w:w="737"/>
+            <w:tcW w:type="dxa" w:w="850"/>
             <w:shd w:fill="1F4E79"/>
             <w:tcMar>
               <w:top w:w="140" w:type="dxa"/>
@@ -286,7 +285,7 @@
         </w:tc>
         <w:tc>
           <w:tcPr>
-            <w:tcW w:type="dxa" w:w="6576"/>
+            <w:tcW w:type="dxa" w:w="8447"/>
             <w:shd w:fill="1F4E79"/>
             <w:tcMar>
               <w:top w:w="140" w:type="dxa"/>
@@ -310,32 +309,6 @@
             </w:r>
           </w:p>
         </w:tc>
-        <w:tc>
-          <w:tcPr>
-            <w:tcW w:type="dxa" w:w="1984"/>
-            <w:shd w:fill="1F4E79"/>
-            <w:tcMar>
-              <w:top w:w="140" w:type="dxa"/>
-              <w:start w:w="190" w:type="dxa"/>
-              <w:bottom w:w="140" w:type="dxa"/>
-              <w:end w:w="190" w:type="dxa"/>
-            </w:tcMar>
-          </w:tcPr>
-          <w:p>
-            <w:pPr>
-              <w:spacing w:after="0"/>
-            </w:pPr>
-            <w:r>
-              <w:rPr>
-                <w:rFonts w:ascii="Times New Roman" w:hAnsi="Times New Roman" w:eastAsia="Times New Roman"/>
-                <w:b/>
-                <w:color w:val="FFFFFF"/>
-                <w:sz w:val="19"/>
-              </w:rPr>
-              <w:t>Trạng thái</w:t>
-            </w:r>
-          </w:p>
-        </w:tc>
       </w:tr>
       <w:tr>
         <w:trPr>
@@ -343,7 +316,7 @@
         </w:trPr>
         <w:tc>
           <w:tcPr>
-            <w:tcW w:type="dxa" w:w="737"/>
+            <w:tcW w:type="dxa" w:w="850"/>
             <w:shd w:fill="EAF2F8"/>
             <w:tcMar>
               <w:top w:w="140" w:type="dxa"/>
@@ -366,7 +339,7 @@
         </w:tc>
         <w:tc>
           <w:tcPr>
-            <w:tcW w:type="dxa" w:w="6576"/>
+            <w:tcW w:type="dxa" w:w="8447"/>
             <w:shd w:fill="EAF2F8"/>
             <w:tcMar>
               <w:top w:w="140" w:type="dxa"/>
@@ -387,29 +360,6 @@
             </w:r>
           </w:p>
         </w:tc>
-        <w:tc>
-          <w:tcPr>
-            <w:tcW w:type="dxa" w:w="1984"/>
-            <w:shd w:fill="EAF2F8"/>
-            <w:tcMar>
-              <w:top w:w="140" w:type="dxa"/>
-              <w:start w:w="190" w:type="dxa"/>
-              <w:bottom w:w="140" w:type="dxa"/>
-              <w:end w:w="190" w:type="dxa"/>
-            </w:tcMar>
-          </w:tcPr>
-          <w:p>
-            <w:pPr>
-              <w:spacing w:after="0"/>
-            </w:pPr>
-            <w:r>
-              <w:rPr>
-                <w:sz w:val="19"/>
-              </w:rPr>
-              <w:t>Hoàn thành</w:t>
-            </w:r>
-          </w:p>
-        </w:tc>
       </w:tr>
       <w:tr>
         <w:trPr>
@@ -417,7 +367,7 @@
         </w:trPr>
         <w:tc>
           <w:tcPr>
-            <w:tcW w:type="dxa" w:w="737"/>
+            <w:tcW w:type="dxa" w:w="850"/>
             <w:tcMar>
               <w:top w:w="140" w:type="dxa"/>
               <w:start w:w="190" w:type="dxa"/>
@@ -439,7 +389,7 @@
         </w:tc>
         <w:tc>
           <w:tcPr>
-            <w:tcW w:type="dxa" w:w="6576"/>
+            <w:tcW w:type="dxa" w:w="8447"/>
             <w:tcMar>
               <w:top w:w="140" w:type="dxa"/>
               <w:start w:w="190" w:type="dxa"/>
@@ -459,28 +409,6 @@
             </w:r>
           </w:p>
         </w:tc>
-        <w:tc>
-          <w:tcPr>
-            <w:tcW w:type="dxa" w:w="1984"/>
-            <w:tcMar>
-              <w:top w:w="140" w:type="dxa"/>
-              <w:start w:w="190" w:type="dxa"/>
-              <w:bottom w:w="140" w:type="dxa"/>
-              <w:end w:w="190" w:type="dxa"/>
-            </w:tcMar>
-          </w:tcPr>
-          <w:p>
-            <w:pPr>
-              <w:spacing w:after="0"/>
-            </w:pPr>
-            <w:r>
-              <w:rPr>
-                <w:sz w:val="19"/>
-              </w:rPr>
-              <w:t>Hoàn thành</w:t>
-            </w:r>
-          </w:p>
-        </w:tc>
       </w:tr>
       <w:tr>
         <w:trPr>
@@ -488,7 +416,7 @@
         </w:trPr>
         <w:tc>
           <w:tcPr>
-            <w:tcW w:type="dxa" w:w="737"/>
+            <w:tcW w:type="dxa" w:w="850"/>
             <w:shd w:fill="EAF2F8"/>
             <w:tcMar>
               <w:top w:w="140" w:type="dxa"/>
@@ -511,7 +439,7 @@
         </w:tc>
         <w:tc>
           <w:tcPr>
-            <w:tcW w:type="dxa" w:w="6576"/>
+            <w:tcW w:type="dxa" w:w="8447"/>
             <w:shd w:fill="EAF2F8"/>
             <w:tcMar>
               <w:top w:w="140" w:type="dxa"/>
@@ -532,29 +460,6 @@
             </w:r>
           </w:p>
         </w:tc>
-        <w:tc>
-          <w:tcPr>
-            <w:tcW w:type="dxa" w:w="1984"/>
-            <w:shd w:fill="EAF2F8"/>
-            <w:tcMar>
-              <w:top w:w="140" w:type="dxa"/>
-              <w:start w:w="190" w:type="dxa"/>
-              <w:bottom w:w="140" w:type="dxa"/>
-              <w:end w:w="190" w:type="dxa"/>
-            </w:tcMar>
-          </w:tcPr>
-          <w:p>
-            <w:pPr>
-              <w:spacing w:after="0"/>
-            </w:pPr>
-            <w:r>
-              <w:rPr>
-                <w:sz w:val="19"/>
-              </w:rPr>
-              <w:t>Hoàn thành</w:t>
-            </w:r>
-          </w:p>
-        </w:tc>
       </w:tr>
       <w:tr>
         <w:trPr>
@@ -562,7 +467,7 @@
         </w:trPr>
         <w:tc>
           <w:tcPr>
-            <w:tcW w:type="dxa" w:w="737"/>
+            <w:tcW w:type="dxa" w:w="850"/>
             <w:tcMar>
               <w:top w:w="140" w:type="dxa"/>
               <w:start w:w="190" w:type="dxa"/>
@@ -584,7 +489,7 @@
         </w:tc>
         <w:tc>
           <w:tcPr>
-            <w:tcW w:type="dxa" w:w="6576"/>
+            <w:tcW w:type="dxa" w:w="8447"/>
             <w:tcMar>
               <w:top w:w="140" w:type="dxa"/>
               <w:start w:w="190" w:type="dxa"/>
@@ -604,28 +509,6 @@
             </w:r>
           </w:p>
         </w:tc>
-        <w:tc>
-          <w:tcPr>
-            <w:tcW w:type="dxa" w:w="1984"/>
-            <w:tcMar>
-              <w:top w:w="140" w:type="dxa"/>
-              <w:start w:w="190" w:type="dxa"/>
-              <w:bottom w:w="140" w:type="dxa"/>
-              <w:end w:w="190" w:type="dxa"/>
-            </w:tcMar>
-          </w:tcPr>
-          <w:p>
-            <w:pPr>
-              <w:spacing w:after="0"/>
-            </w:pPr>
-            <w:r>
-              <w:rPr>
-                <w:sz w:val="19"/>
-              </w:rPr>
-              <w:t>Hoàn thành</w:t>
-            </w:r>
-          </w:p>
-        </w:tc>
       </w:tr>
       <w:tr>
         <w:trPr>
@@ -633,7 +516,7 @@
         </w:trPr>
         <w:tc>
           <w:tcPr>
-            <w:tcW w:type="dxa" w:w="737"/>
+            <w:tcW w:type="dxa" w:w="850"/>
             <w:shd w:fill="EAF2F8"/>
             <w:tcMar>
               <w:top w:w="140" w:type="dxa"/>
@@ -656,7 +539,7 @@
         </w:tc>
         <w:tc>
           <w:tcPr>
-            <w:tcW w:type="dxa" w:w="6576"/>
+            <w:tcW w:type="dxa" w:w="8447"/>
             <w:shd w:fill="EAF2F8"/>
             <w:tcMar>
               <w:top w:w="140" w:type="dxa"/>
@@ -677,29 +560,6 @@
             </w:r>
           </w:p>
         </w:tc>
-        <w:tc>
-          <w:tcPr>
-            <w:tcW w:type="dxa" w:w="1984"/>
-            <w:shd w:fill="EAF2F8"/>
-            <w:tcMar>
-              <w:top w:w="140" w:type="dxa"/>
-              <w:start w:w="190" w:type="dxa"/>
-              <w:bottom w:w="140" w:type="dxa"/>
-              <w:end w:w="190" w:type="dxa"/>
-            </w:tcMar>
-          </w:tcPr>
-          <w:p>
-            <w:pPr>
-              <w:spacing w:after="0"/>
-            </w:pPr>
-            <w:r>
-              <w:rPr>
-                <w:sz w:val="19"/>
-              </w:rPr>
-              <w:t>Hoàn thành</w:t>
-            </w:r>
-          </w:p>
-        </w:tc>
       </w:tr>
       <w:tr>
         <w:trPr>
@@ -707,7 +567,7 @@
         </w:trPr>
         <w:tc>
           <w:tcPr>
-            <w:tcW w:type="dxa" w:w="737"/>
+            <w:tcW w:type="dxa" w:w="850"/>
             <w:tcMar>
               <w:top w:w="140" w:type="dxa"/>
               <w:start w:w="190" w:type="dxa"/>
@@ -729,7 +589,7 @@
         </w:tc>
         <w:tc>
           <w:tcPr>
-            <w:tcW w:type="dxa" w:w="6576"/>
+            <w:tcW w:type="dxa" w:w="8447"/>
             <w:tcMar>
               <w:top w:w="140" w:type="dxa"/>
               <w:start w:w="190" w:type="dxa"/>
@@ -749,28 +609,6 @@
             </w:r>
           </w:p>
         </w:tc>
-        <w:tc>
-          <w:tcPr>
-            <w:tcW w:type="dxa" w:w="1984"/>
-            <w:tcMar>
-              <w:top w:w="140" w:type="dxa"/>
-              <w:start w:w="190" w:type="dxa"/>
-              <w:bottom w:w="140" w:type="dxa"/>
-              <w:end w:w="190" w:type="dxa"/>
-            </w:tcMar>
-          </w:tcPr>
-          <w:p>
-            <w:pPr>
-              <w:spacing w:after="0"/>
-            </w:pPr>
-            <w:r>
-              <w:rPr>
-                <w:sz w:val="19"/>
-              </w:rPr>
-              <w:t>Hoàn thành</w:t>
-            </w:r>
-          </w:p>
-        </w:tc>
       </w:tr>
       <w:tr>
         <w:trPr>
@@ -778,7 +616,7 @@
         </w:trPr>
         <w:tc>
           <w:tcPr>
-            <w:tcW w:type="dxa" w:w="737"/>
+            <w:tcW w:type="dxa" w:w="850"/>
             <w:shd w:fill="EAF2F8"/>
             <w:tcMar>
               <w:top w:w="140" w:type="dxa"/>
@@ -801,7 +639,7 @@
         </w:tc>
         <w:tc>
           <w:tcPr>
-            <w:tcW w:type="dxa" w:w="6576"/>
+            <w:tcW w:type="dxa" w:w="8447"/>
             <w:shd w:fill="EAF2F8"/>
             <w:tcMar>
               <w:top w:w="140" w:type="dxa"/>
@@ -822,29 +660,6 @@
             </w:r>
           </w:p>
         </w:tc>
-        <w:tc>
-          <w:tcPr>
-            <w:tcW w:type="dxa" w:w="1984"/>
-            <w:shd w:fill="EAF2F8"/>
-            <w:tcMar>
-              <w:top w:w="140" w:type="dxa"/>
-              <w:start w:w="190" w:type="dxa"/>
-              <w:bottom w:w="140" w:type="dxa"/>
-              <w:end w:w="190" w:type="dxa"/>
-            </w:tcMar>
-          </w:tcPr>
-          <w:p>
-            <w:pPr>
-              <w:spacing w:after="0"/>
-            </w:pPr>
-            <w:r>
-              <w:rPr>
-                <w:sz w:val="19"/>
-              </w:rPr>
-              <w:t>Hoàn thành</w:t>
-            </w:r>
-          </w:p>
-        </w:tc>
       </w:tr>
       <w:tr>
         <w:trPr>
@@ -852,7 +667,7 @@
         </w:trPr>
         <w:tc>
           <w:tcPr>
-            <w:tcW w:type="dxa" w:w="737"/>
+            <w:tcW w:type="dxa" w:w="850"/>
             <w:tcMar>
               <w:top w:w="140" w:type="dxa"/>
               <w:start w:w="190" w:type="dxa"/>
@@ -874,7 +689,7 @@
         </w:tc>
         <w:tc>
           <w:tcPr>
-            <w:tcW w:type="dxa" w:w="6576"/>
+            <w:tcW w:type="dxa" w:w="8447"/>
             <w:tcMar>
               <w:top w:w="140" w:type="dxa"/>
               <w:start w:w="190" w:type="dxa"/>
@@ -894,28 +709,6 @@
             </w:r>
           </w:p>
         </w:tc>
-        <w:tc>
-          <w:tcPr>
-            <w:tcW w:type="dxa" w:w="1984"/>
-            <w:tcMar>
-              <w:top w:w="140" w:type="dxa"/>
-              <w:start w:w="190" w:type="dxa"/>
-              <w:bottom w:w="140" w:type="dxa"/>
-              <w:end w:w="190" w:type="dxa"/>
-            </w:tcMar>
-          </w:tcPr>
-          <w:p>
-            <w:pPr>
-              <w:spacing w:after="0"/>
-            </w:pPr>
-            <w:r>
-              <w:rPr>
-                <w:sz w:val="19"/>
-              </w:rPr>
-              <w:t>Hoàn thành</w:t>
-            </w:r>
-          </w:p>
-        </w:tc>
       </w:tr>
       <w:tr>
         <w:trPr>
@@ -923,7 +716,7 @@
         </w:trPr>
         <w:tc>
           <w:tcPr>
-            <w:tcW w:type="dxa" w:w="737"/>
+            <w:tcW w:type="dxa" w:w="850"/>
             <w:shd w:fill="EAF2F8"/>
             <w:tcMar>
               <w:top w:w="140" w:type="dxa"/>
@@ -946,7 +739,7 @@
         </w:tc>
         <w:tc>
           <w:tcPr>
-            <w:tcW w:type="dxa" w:w="6576"/>
+            <w:tcW w:type="dxa" w:w="8447"/>
             <w:shd w:fill="EAF2F8"/>
             <w:tcMar>
               <w:top w:w="140" w:type="dxa"/>
@@ -964,29 +757,6 @@
                 <w:sz w:val="19"/>
               </w:rPr>
               <w:t>Bài về nhà 3 - Danh bạ A đến Z</w:t>
-            </w:r>
-          </w:p>
-        </w:tc>
-        <w:tc>
-          <w:tcPr>
-            <w:tcW w:type="dxa" w:w="1984"/>
-            <w:shd w:fill="EAF2F8"/>
-            <w:tcMar>
-              <w:top w:w="140" w:type="dxa"/>
-              <w:start w:w="190" w:type="dxa"/>
-              <w:bottom w:w="140" w:type="dxa"/>
-              <w:end w:w="190" w:type="dxa"/>
-            </w:tcMar>
-          </w:tcPr>
-          <w:p>
-            <w:pPr>
-              <w:spacing w:after="0"/>
-            </w:pPr>
-            <w:r>
-              <w:rPr>
-                <w:sz w:val="19"/>
-              </w:rPr>
-              <w:t>Hoàn thành</w:t>
             </w:r>
           </w:p>
         </w:tc>

</xml_diff>